<commit_message>
Progression on the final project report
</commit_message>
<xml_diff>
--- a/EDA - F1 project - Ido Brener, Roee Amsalem, And Oren Yehezkel.docx
+++ b/EDA - F1 project - Ido Brener, Roee Amsalem, And Oren Yehezkel.docx
@@ -569,13 +569,7 @@
         <w:rPr>
           <w:rFonts w:ascii="David" w:hAnsi="David" w:cs="David"/>
         </w:rPr>
-        <w:t xml:space="preserve">Each row </w:t>
-      </w:r>
-      <w:r>
-        <w:rPr>
-          <w:rFonts w:ascii="David" w:hAnsi="David" w:cs="David"/>
-        </w:rPr>
-        <w:t>is a sample taken in a certain time during the fastest lap of each driver in a qualifying round during one of the 4 races.</w:t>
+        <w:t>Each row is a sample taken in a certain time during the fastest lap of each driver in a qualifying round during one of the 4 races.</w:t>
       </w:r>
     </w:p>
     <w:p>
@@ -793,31 +787,7 @@
         <w:rPr>
           <w:rFonts w:ascii="David" w:hAnsi="David" w:cs="David"/>
         </w:rPr>
-        <w:t>lap</w:t>
-      </w:r>
-      <w:r>
-        <w:rPr>
-          <w:rFonts w:ascii="David" w:hAnsi="David" w:cs="David"/>
-        </w:rPr>
-        <w:t>_</w:t>
-      </w:r>
-      <w:r>
-        <w:rPr>
-          <w:rFonts w:ascii="David" w:hAnsi="David" w:cs="David"/>
-        </w:rPr>
-        <w:t xml:space="preserve">duration </w:t>
-      </w:r>
-      <w:r>
-        <w:rPr>
-          <w:rFonts w:ascii="David" w:hAnsi="David" w:cs="David"/>
-        </w:rPr>
-        <w:t xml:space="preserve">– </w:t>
-      </w:r>
-      <w:r>
-        <w:rPr>
-          <w:rFonts w:ascii="David" w:hAnsi="David" w:cs="David"/>
-        </w:rPr>
-        <w:t>the time needed to do the lap</w:t>
+        <w:t>lap_duration – the time needed to do the lap</w:t>
       </w:r>
     </w:p>
     <w:p>
@@ -837,13 +807,7 @@
         <w:rPr>
           <w:rFonts w:ascii="David" w:hAnsi="David" w:cs="David"/>
         </w:rPr>
-        <w:t xml:space="preserve">Units: </w:t>
-      </w:r>
-      <w:r>
-        <w:rPr>
-          <w:rFonts w:ascii="David" w:hAnsi="David" w:cs="David"/>
-        </w:rPr>
-        <w:t>seconds</w:t>
+        <w:t>Units: seconds</w:t>
       </w:r>
     </w:p>
     <w:p>
@@ -864,13 +828,7 @@
           <w:rFonts w:ascii="David" w:hAnsi="David" w:cs="David"/>
         </w:rPr>
         <w:lastRenderedPageBreak/>
-        <w:t>Possible value range: 0-</w:t>
-      </w:r>
-      <w:r>
-        <w:rPr>
-          <w:rFonts w:ascii="David" w:hAnsi="David" w:cs="David"/>
-        </w:rPr>
-        <w:t>130 seconds</w:t>
+        <w:t>Possible value range: 0-130 seconds</w:t>
       </w:r>
     </w:p>
     <w:p>
@@ -890,25 +848,7 @@
         <w:rPr>
           <w:rFonts w:ascii="David" w:hAnsi="David" w:cs="David"/>
         </w:rPr>
-        <w:t>x</w:t>
-      </w:r>
-      <w:r>
-        <w:rPr>
-          <w:rFonts w:ascii="David" w:hAnsi="David" w:cs="David"/>
-        </w:rPr>
-        <w:t xml:space="preserve"> – the</w:t>
-      </w:r>
-      <w:r>
-        <w:rPr>
-          <w:rFonts w:ascii="David" w:hAnsi="David" w:cs="David"/>
-        </w:rPr>
-        <w:t xml:space="preserve"> drivers position in the x axis</w:t>
-      </w:r>
-      <w:r>
-        <w:rPr>
-          <w:rFonts w:ascii="David" w:hAnsi="David" w:cs="David"/>
-        </w:rPr>
-        <w:t>.</w:t>
+        <w:t>x – the drivers position in the x axis.</w:t>
       </w:r>
     </w:p>
     <w:p>
@@ -928,13 +868,7 @@
         <w:rPr>
           <w:rFonts w:ascii="David" w:hAnsi="David" w:cs="David"/>
         </w:rPr>
-        <w:t xml:space="preserve">Units: </w:t>
-      </w:r>
-      <w:r>
-        <w:rPr>
-          <w:rFonts w:ascii="David" w:hAnsi="David" w:cs="David"/>
-        </w:rPr>
-        <w:t>irrelevant.</w:t>
+        <w:t>Units: irrelevant.</w:t>
       </w:r>
     </w:p>
     <w:p>
@@ -954,13 +888,7 @@
         <w:rPr>
           <w:rFonts w:ascii="David" w:hAnsi="David" w:cs="David"/>
         </w:rPr>
-        <w:t xml:space="preserve">Possible value range: </w:t>
-      </w:r>
-      <w:r>
-        <w:rPr>
-          <w:rFonts w:ascii="David" w:hAnsi="David" w:cs="David"/>
-        </w:rPr>
-        <w:t>-15000 - 15000</w:t>
+        <w:t>Possible value range: -15000 - 15000</w:t>
       </w:r>
     </w:p>
     <w:p>
@@ -980,19 +908,7 @@
         <w:rPr>
           <w:rFonts w:ascii="David" w:hAnsi="David" w:cs="David"/>
         </w:rPr>
-        <w:t>y</w:t>
-      </w:r>
-      <w:r>
-        <w:rPr>
-          <w:rFonts w:ascii="David" w:hAnsi="David" w:cs="David"/>
-        </w:rPr>
-        <w:t xml:space="preserve"> – the </w:t>
-      </w:r>
-      <w:r>
-        <w:rPr>
-          <w:rFonts w:ascii="David" w:hAnsi="David" w:cs="David"/>
-        </w:rPr>
-        <w:t>drivers position in the y axis.</w:t>
+        <w:t>y – the drivers position in the y axis.</w:t>
       </w:r>
     </w:p>
     <w:p>
@@ -1012,13 +928,7 @@
         <w:rPr>
           <w:rFonts w:ascii="David" w:hAnsi="David" w:cs="David"/>
         </w:rPr>
-        <w:t xml:space="preserve">Units: </w:t>
-      </w:r>
-      <w:r>
-        <w:rPr>
-          <w:rFonts w:ascii="David" w:hAnsi="David" w:cs="David"/>
-        </w:rPr>
-        <w:t>irrelevant.</w:t>
+        <w:t>Units: irrelevant.</w:t>
       </w:r>
     </w:p>
     <w:p>
@@ -1038,13 +948,7 @@
         <w:rPr>
           <w:rFonts w:ascii="David" w:hAnsi="David" w:cs="David"/>
         </w:rPr>
-        <w:t xml:space="preserve">Possible value range: </w:t>
-      </w:r>
-      <w:r>
-        <w:rPr>
-          <w:rFonts w:ascii="David" w:hAnsi="David" w:cs="David"/>
-        </w:rPr>
-        <w:t>-20000 - 20000</w:t>
+        <w:t>Possible value range: -20000 - 20000</w:t>
       </w:r>
     </w:p>
     <w:p>
@@ -1753,31 +1657,7 @@
         <w:rPr>
           <w:rFonts w:ascii="David" w:hAnsi="David" w:cs="David"/>
         </w:rPr>
-        <w:t>{</w:t>
-      </w:r>
-      <w:r>
-        <w:rPr>
-          <w:rFonts w:ascii="David" w:hAnsi="David" w:cs="David"/>
-        </w:rPr>
-        <w:t>1</w:t>
-      </w:r>
-      <w:r>
-        <w:rPr>
-          <w:rFonts w:ascii="David" w:hAnsi="David" w:cs="David"/>
-        </w:rPr>
-        <w:t xml:space="preserve">, </w:t>
-      </w:r>
-      <w:r>
-        <w:rPr>
-          <w:rFonts w:ascii="David" w:hAnsi="David" w:cs="David"/>
-        </w:rPr>
-        <w:t>2</w:t>
-      </w:r>
-      <w:r>
-        <w:rPr>
-          <w:rFonts w:ascii="David" w:hAnsi="David" w:cs="David"/>
-        </w:rPr>
-        <w:t>,</w:t>
+        <w:t>{1, 2,</w:t>
       </w:r>
       <w:r>
         <w:rPr>
@@ -1789,205 +1669,7 @@
         <w:rPr>
           <w:rFonts w:ascii="David" w:hAnsi="David" w:cs="David"/>
         </w:rPr>
-        <w:t xml:space="preserve"> </w:t>
-      </w:r>
-      <w:r>
-        <w:rPr>
-          <w:rFonts w:ascii="David" w:hAnsi="David" w:cs="David"/>
-        </w:rPr>
-        <w:t>4</w:t>
-      </w:r>
-      <w:r>
-        <w:rPr>
-          <w:rFonts w:ascii="David" w:hAnsi="David" w:cs="David"/>
-        </w:rPr>
-        <w:t xml:space="preserve">, </w:t>
-      </w:r>
-      <w:r>
-        <w:rPr>
-          <w:rFonts w:ascii="David" w:hAnsi="David" w:cs="David"/>
-        </w:rPr>
-        <w:t>10</w:t>
-      </w:r>
-      <w:r>
-        <w:rPr>
-          <w:rFonts w:ascii="David" w:hAnsi="David" w:cs="David"/>
-        </w:rPr>
-        <w:t xml:space="preserve">, </w:t>
-      </w:r>
-      <w:r>
-        <w:rPr>
-          <w:rFonts w:ascii="David" w:hAnsi="David" w:cs="David"/>
-        </w:rPr>
-        <w:t>11</w:t>
-      </w:r>
-      <w:r>
-        <w:rPr>
-          <w:rFonts w:ascii="David" w:hAnsi="David" w:cs="David"/>
-        </w:rPr>
-        <w:t xml:space="preserve">, </w:t>
-      </w:r>
-      <w:r>
-        <w:rPr>
-          <w:rFonts w:ascii="David" w:hAnsi="David" w:cs="David"/>
-        </w:rPr>
-        <w:t>14</w:t>
-      </w:r>
-      <w:r>
-        <w:rPr>
-          <w:rFonts w:ascii="David" w:hAnsi="David" w:cs="David"/>
-        </w:rPr>
-        <w:t xml:space="preserve">, </w:t>
-      </w:r>
-      <w:r>
-        <w:rPr>
-          <w:rFonts w:ascii="David" w:hAnsi="David" w:cs="David"/>
-        </w:rPr>
-        <w:t>16</w:t>
-      </w:r>
-      <w:r>
-        <w:rPr>
-          <w:rFonts w:ascii="David" w:hAnsi="David" w:cs="David"/>
-        </w:rPr>
-        <w:t xml:space="preserve">, </w:t>
-      </w:r>
-      <w:r>
-        <w:rPr>
-          <w:rFonts w:ascii="David" w:hAnsi="David" w:cs="David"/>
-        </w:rPr>
-        <w:t>18</w:t>
-      </w:r>
-      <w:r>
-        <w:rPr>
-          <w:rFonts w:ascii="David" w:hAnsi="David" w:cs="David"/>
-        </w:rPr>
-        <w:t xml:space="preserve">, </w:t>
-      </w:r>
-      <w:r>
-        <w:rPr>
-          <w:rFonts w:ascii="David" w:hAnsi="David" w:cs="David"/>
-        </w:rPr>
-        <w:t>20</w:t>
-      </w:r>
-      <w:r>
-        <w:rPr>
-          <w:rFonts w:ascii="David" w:hAnsi="David" w:cs="David"/>
-        </w:rPr>
-        <w:t xml:space="preserve">, </w:t>
-      </w:r>
-      <w:r>
-        <w:rPr>
-          <w:rFonts w:ascii="David" w:hAnsi="David" w:cs="David"/>
-        </w:rPr>
-        <w:t>22</w:t>
-      </w:r>
-      <w:r>
-        <w:rPr>
-          <w:rFonts w:ascii="David" w:hAnsi="David" w:cs="David"/>
-        </w:rPr>
-        <w:t xml:space="preserve">, </w:t>
-      </w:r>
-      <w:r>
-        <w:rPr>
-          <w:rFonts w:ascii="David" w:hAnsi="David" w:cs="David"/>
-        </w:rPr>
-        <w:t>23</w:t>
-      </w:r>
-      <w:r>
-        <w:rPr>
-          <w:rFonts w:ascii="David" w:hAnsi="David" w:cs="David"/>
-        </w:rPr>
-        <w:t xml:space="preserve">, </w:t>
-      </w:r>
-      <w:r>
-        <w:rPr>
-          <w:rFonts w:ascii="David" w:hAnsi="David" w:cs="David"/>
-        </w:rPr>
-        <w:t>24</w:t>
-      </w:r>
-      <w:r>
-        <w:rPr>
-          <w:rFonts w:ascii="David" w:hAnsi="David" w:cs="David"/>
-        </w:rPr>
-        <w:t xml:space="preserve">, </w:t>
-      </w:r>
-      <w:r>
-        <w:rPr>
-          <w:rFonts w:ascii="David" w:hAnsi="David" w:cs="David"/>
-        </w:rPr>
-        <w:t>27</w:t>
-      </w:r>
-      <w:r>
-        <w:rPr>
-          <w:rFonts w:ascii="David" w:hAnsi="David" w:cs="David"/>
-        </w:rPr>
-        <w:t xml:space="preserve">, </w:t>
-      </w:r>
-      <w:r>
-        <w:rPr>
-          <w:rFonts w:ascii="David" w:hAnsi="David" w:cs="David"/>
-        </w:rPr>
-        <w:t>31</w:t>
-      </w:r>
-      <w:r>
-        <w:rPr>
-          <w:rFonts w:ascii="David" w:hAnsi="David" w:cs="David"/>
-        </w:rPr>
-        <w:t xml:space="preserve">, </w:t>
-      </w:r>
-      <w:r>
-        <w:rPr>
-          <w:rFonts w:ascii="David" w:hAnsi="David" w:cs="David"/>
-        </w:rPr>
-        <w:t>40</w:t>
-      </w:r>
-      <w:r>
-        <w:rPr>
-          <w:rFonts w:ascii="David" w:hAnsi="David" w:cs="David"/>
-        </w:rPr>
-        <w:t xml:space="preserve">, </w:t>
-      </w:r>
-      <w:r>
-        <w:rPr>
-          <w:rFonts w:ascii="David" w:hAnsi="David" w:cs="David"/>
-        </w:rPr>
-        <w:t>44</w:t>
-      </w:r>
-      <w:r>
-        <w:rPr>
-          <w:rFonts w:ascii="David" w:hAnsi="David" w:cs="David"/>
-        </w:rPr>
-        <w:t xml:space="preserve">, </w:t>
-      </w:r>
-      <w:r>
-        <w:rPr>
-          <w:rFonts w:ascii="David" w:hAnsi="David" w:cs="David"/>
-        </w:rPr>
-        <w:t>55</w:t>
-      </w:r>
-      <w:r>
-        <w:rPr>
-          <w:rFonts w:ascii="David" w:hAnsi="David" w:cs="David"/>
-        </w:rPr>
-        <w:t xml:space="preserve">, </w:t>
-      </w:r>
-      <w:r>
-        <w:rPr>
-          <w:rFonts w:ascii="David" w:hAnsi="David" w:cs="David"/>
-        </w:rPr>
-        <w:t>63</w:t>
-      </w:r>
-      <w:r>
-        <w:rPr>
-          <w:rFonts w:ascii="David" w:hAnsi="David" w:cs="David"/>
-        </w:rPr>
-        <w:t xml:space="preserve">, </w:t>
-      </w:r>
-      <w:r>
-        <w:rPr>
-          <w:rFonts w:ascii="David" w:hAnsi="David" w:cs="David"/>
-        </w:rPr>
-        <w:t>77</w:t>
+        <w:t xml:space="preserve"> 4, 10, 11, 14, 16, 18, 20, 22, 23, 24, 27, 31, 40, 44, 55, 63, 77</w:t>
       </w:r>
       <w:r>
         <w:rPr>
@@ -3162,7 +2844,7 @@
         <w:bidi w:val="0"/>
         <w:spacing w:after="0" w:line="360" w:lineRule="auto"/>
         <w:rPr>
-          <w:rFonts w:ascii="David" w:hAnsi="David" w:cs="David" w:hint="cs"/>
+          <w:rFonts w:ascii="David" w:hAnsi="David" w:cs="David"/>
           <w:rtl/>
         </w:rPr>
       </w:pPr>
@@ -3379,7 +3061,7 @@
       <w:pPr>
         <w:spacing w:after="0" w:line="360" w:lineRule="auto"/>
         <w:rPr>
-          <w:rFonts w:ascii="David" w:hAnsi="David" w:cs="David" w:hint="cs"/>
+          <w:rFonts w:ascii="David" w:hAnsi="David" w:cs="David"/>
           <w:rtl/>
         </w:rPr>
       </w:pPr>
@@ -4461,19 +4143,7 @@
         <w:rPr>
           <w:rFonts w:ascii="David" w:hAnsi="David" w:cs="David"/>
         </w:rPr>
-        <w:t xml:space="preserve">After using box plots to analyze the data, we have reached </w:t>
-      </w:r>
-      <w:r>
-        <w:rPr>
-          <w:rFonts w:ascii="David" w:hAnsi="David" w:cs="David"/>
-        </w:rPr>
-        <w:t xml:space="preserve">a few </w:t>
-      </w:r>
-      <w:r>
-        <w:rPr>
-          <w:rFonts w:ascii="David" w:hAnsi="David" w:cs="David"/>
-        </w:rPr>
-        <w:t>conclusions:</w:t>
+        <w:t>After using box plots to analyze the data, we have reached a few conclusions:</w:t>
       </w:r>
     </w:p>
     <w:p>
@@ -4558,6 +4228,7 @@
       <w:r>
         <w:rPr>
           <w:rFonts w:ascii="David" w:hAnsi="David" w:cs="David"/>
+          <w:noProof/>
         </w:rPr>
         <w:drawing>
           <wp:anchor distT="0" distB="0" distL="114300" distR="114300" simplePos="0" relativeHeight="251660288" behindDoc="0" locked="0" layoutInCell="1" allowOverlap="1" wp14:anchorId="4703DF16" wp14:editId="4582A51A">
@@ -6427,6 +6098,7 @@
       <w:r>
         <w:rPr>
           <w:rFonts w:ascii="David" w:hAnsi="David" w:cs="David"/>
+          <w:noProof/>
         </w:rPr>
         <w:drawing>
           <wp:anchor distT="0" distB="0" distL="114300" distR="114300" simplePos="0" relativeHeight="251658240" behindDoc="0" locked="0" layoutInCell="1" allowOverlap="1" wp14:anchorId="1FFB88A6" wp14:editId="396D9F54">
@@ -6531,6 +6203,7 @@
       <w:r>
         <w:rPr>
           <w:rFonts w:ascii="David" w:hAnsi="David" w:cs="David"/>
+          <w:noProof/>
         </w:rPr>
         <w:drawing>
           <wp:anchor distT="0" distB="0" distL="114300" distR="114300" simplePos="0" relativeHeight="251659264" behindDoc="0" locked="0" layoutInCell="1" allowOverlap="1" wp14:anchorId="55923E97" wp14:editId="79AA841E">
@@ -6607,7 +6280,7 @@
         <w:bidi w:val="0"/>
         <w:spacing w:after="0" w:line="360" w:lineRule="auto"/>
         <w:rPr>
-          <w:rFonts w:ascii="David" w:hAnsi="David" w:cs="David" w:hint="cs"/>
+          <w:rFonts w:ascii="David" w:hAnsi="David" w:cs="David"/>
           <w:rtl/>
         </w:rPr>
       </w:pPr>
@@ -6781,6 +6454,7 @@
       <w:r>
         <w:rPr>
           <w:rFonts w:ascii="David" w:hAnsi="David" w:cs="David"/>
+          <w:noProof/>
         </w:rPr>
         <w:drawing>
           <wp:anchor distT="0" distB="0" distL="114300" distR="114300" simplePos="0" relativeHeight="251667456" behindDoc="0" locked="0" layoutInCell="1" allowOverlap="1" wp14:anchorId="22AF7922" wp14:editId="52E5D369">
@@ -6869,6 +6543,7 @@
       <w:r>
         <w:rPr>
           <w:rFonts w:ascii="David" w:hAnsi="David" w:cs="David"/>
+          <w:noProof/>
         </w:rPr>
         <w:drawing>
           <wp:anchor distT="0" distB="0" distL="114300" distR="114300" simplePos="0" relativeHeight="251668480" behindDoc="0" locked="0" layoutInCell="1" allowOverlap="1" wp14:anchorId="2C3935F9" wp14:editId="298E4B27">
@@ -6951,6 +6626,7 @@
       <w:r>
         <w:rPr>
           <w:rFonts w:ascii="David" w:hAnsi="David" w:cs="David"/>
+          <w:noProof/>
         </w:rPr>
         <w:lastRenderedPageBreak/>
         <w:drawing>
@@ -7072,6 +6748,7 @@
       <w:r>
         <w:rPr>
           <w:rFonts w:ascii="David" w:hAnsi="David" w:cs="David"/>
+          <w:noProof/>
         </w:rPr>
         <w:drawing>
           <wp:anchor distT="0" distB="0" distL="114300" distR="114300" simplePos="0" relativeHeight="251662336" behindDoc="0" locked="0" layoutInCell="1" allowOverlap="1" wp14:anchorId="79435A7A" wp14:editId="6C796183">
@@ -7191,6 +6868,7 @@
           <w:rFonts w:ascii="David" w:hAnsi="David" w:cs="David"/>
           <w:b/>
           <w:bCs/>
+          <w:noProof/>
         </w:rPr>
         <w:lastRenderedPageBreak/>
         <w:drawing>
@@ -7263,6 +6941,7 @@
       <w:r>
         <w:rPr>
           <w:rFonts w:ascii="David" w:hAnsi="David" w:cs="David"/>
+          <w:noProof/>
         </w:rPr>
         <w:drawing>
           <wp:anchor distT="0" distB="0" distL="114300" distR="114300" simplePos="0" relativeHeight="251664384" behindDoc="0" locked="0" layoutInCell="1" allowOverlap="1" wp14:anchorId="28B6C8AA" wp14:editId="5325B2CF">
@@ -7354,6 +7033,7 @@
           <w:rFonts w:ascii="David" w:hAnsi="David" w:cs="David"/>
           <w:b/>
           <w:bCs/>
+          <w:noProof/>
         </w:rPr>
         <w:lastRenderedPageBreak/>
         <w:drawing>
@@ -7706,13 +7386,7 @@
         <w:rPr>
           <w:rFonts w:ascii="David" w:hAnsi="David" w:cs="David"/>
         </w:rPr>
-        <w:t xml:space="preserve">global_corner_id – </w:t>
-      </w:r>
-      <w:r>
-        <w:rPr>
-          <w:rFonts w:ascii="David" w:hAnsi="David" w:cs="David"/>
-        </w:rPr>
-        <w:t>given to each group of points that belong to the same corner using the geometric algorithm we used.</w:t>
+        <w:t>global_corner_id – given to each group of points that belong to the same corner using the geometric algorithm we used.</w:t>
       </w:r>
     </w:p>
     <w:p>
@@ -7732,13 +7406,7 @@
         <w:rPr>
           <w:rFonts w:ascii="David" w:hAnsi="David" w:cs="David"/>
         </w:rPr>
-        <w:t xml:space="preserve">entry_speed – </w:t>
-      </w:r>
-      <w:r>
-        <w:rPr>
-          <w:rFonts w:ascii="David" w:hAnsi="David" w:cs="David"/>
-        </w:rPr>
-        <w:t xml:space="preserve">taking the first speed measurment classified as </w:t>
+        <w:t xml:space="preserve">entry_speed – taking the first speed measurment classified as </w:t>
       </w:r>
       <w:r>
         <w:rPr>
@@ -7794,13 +7462,7 @@
         <w:rPr>
           <w:rFonts w:ascii="David" w:hAnsi="David" w:cs="David"/>
         </w:rPr>
-        <w:t xml:space="preserve">apex_speed – </w:t>
-      </w:r>
-      <w:r>
-        <w:rPr>
-          <w:rFonts w:ascii="David" w:hAnsi="David" w:cs="David"/>
-        </w:rPr>
-        <w:t xml:space="preserve">taking the minimal speed in every group of points classified as </w:t>
+        <w:t xml:space="preserve">apex_speed – taking the minimal speed in every group of points classified as </w:t>
       </w:r>
       <w:r>
         <w:rPr>
@@ -7850,25 +7512,7 @@
         <w:rPr>
           <w:rFonts w:ascii="David" w:hAnsi="David" w:cs="David"/>
         </w:rPr>
-        <w:t xml:space="preserve"> </w:t>
-      </w:r>
-      <w:r>
-        <w:rPr>
-          <w:rFonts w:ascii="David" w:hAnsi="David" w:cs="David"/>
-        </w:rPr>
-        <w:t xml:space="preserve">taking the </w:t>
-      </w:r>
-      <w:r>
-        <w:rPr>
-          <w:rFonts w:ascii="David" w:hAnsi="David" w:cs="David"/>
-        </w:rPr>
-        <w:t xml:space="preserve">last </w:t>
-      </w:r>
-      <w:r>
-        <w:rPr>
-          <w:rFonts w:ascii="David" w:hAnsi="David" w:cs="David"/>
-        </w:rPr>
-        <w:t xml:space="preserve">speed measurment classified as </w:t>
+        <w:t xml:space="preserve"> taking the last speed measurment classified as </w:t>
       </w:r>
       <w:r>
         <w:rPr>
@@ -8061,25 +7705,7 @@
         <w:rPr>
           <w:rFonts w:ascii="David" w:hAnsi="David" w:cs="David"/>
         </w:rPr>
-        <w:t xml:space="preserve">calculating the precentage of the measurments before the apex point that had brake = 100 (brake is boolean) </w:t>
-      </w:r>
-      <w:r>
-        <w:rPr>
-          <w:rFonts w:ascii="David" w:hAnsi="David" w:cs="David"/>
-        </w:rPr>
-        <w:t xml:space="preserve">and throttle &lt; 5% </w:t>
-      </w:r>
-      <w:r>
-        <w:rPr>
-          <w:rFonts w:ascii="David" w:hAnsi="David" w:cs="David"/>
-        </w:rPr>
-        <w:t>in them out of all the measurments before the apex point</w:t>
-      </w:r>
-      <w:r>
-        <w:rPr>
-          <w:rFonts w:ascii="David" w:hAnsi="David" w:cs="David"/>
-        </w:rPr>
-        <w:t>.</w:t>
+        <w:t>calculating the precentage of the measurments before the apex point that had brake = 100 (brake is boolean) and throttle &lt; 5% in them out of all the measurments before the apex point.</w:t>
       </w:r>
     </w:p>
     <w:p>
@@ -8144,24 +7770,7 @@
           <w:rFonts w:ascii="David" w:hAnsi="David" w:cs="David"/>
         </w:rPr>
         <w:br/>
-      </w:r>
-      <w:r>
-        <w:rPr>
-          <w:rFonts w:ascii="David" w:hAnsi="David" w:cs="David"/>
-        </w:rPr>
-        <w:t xml:space="preserve">brake = 0 and throttle &lt; </w:t>
-      </w:r>
-      <w:r>
-        <w:rPr>
-          <w:rFonts w:ascii="David" w:hAnsi="David" w:cs="David"/>
-        </w:rPr>
-        <w:t>10</w:t>
-      </w:r>
-      <w:r>
-        <w:rPr>
-          <w:rFonts w:ascii="David" w:hAnsi="David" w:cs="David"/>
-        </w:rPr>
-        <w:t>% in them out of all the measurments before the apex point.</w:t>
+        <w:t>brake = 0 and throttle &lt; 10% in them out of all the measurments before the apex point.</w:t>
       </w:r>
     </w:p>
     <w:p>
@@ -8284,19 +7893,7 @@
         <w:rPr>
           <w:rFonts w:ascii="David" w:hAnsi="David" w:cs="David"/>
         </w:rPr>
-        <w:t xml:space="preserve">calculating the average </w:t>
-      </w:r>
-      <w:r>
-        <w:rPr>
-          <w:rFonts w:ascii="David" w:hAnsi="David" w:cs="David"/>
-        </w:rPr>
-        <w:t xml:space="preserve">speed </w:t>
-      </w:r>
-      <w:r>
-        <w:rPr>
-          <w:rFonts w:ascii="David" w:hAnsi="David" w:cs="David"/>
-        </w:rPr>
-        <w:t>across all measurments that belong to the turn.</w:t>
+        <w:t>calculating the average speed across all measurments that belong to the turn.</w:t>
       </w:r>
     </w:p>
     <w:p>
@@ -8893,15 +8490,6 @@
           <w:szCs w:val="32"/>
         </w:rPr>
         <w:tab/>
-      </w:r>
-      <w:r>
-        <w:rPr>
-          <w:rFonts w:ascii="David" w:hAnsi="David" w:cs="David"/>
-          <w:b/>
-          <w:bCs/>
-          <w:sz w:val="32"/>
-          <w:szCs w:val="32"/>
-        </w:rPr>
         <w:t>Unbalanced Data</w:t>
       </w:r>
       <w:r>
@@ -8993,31 +8581,7 @@
           <w:b/>
           <w:bCs/>
         </w:rPr>
-        <w:t xml:space="preserve">Driver Representation </w:t>
-      </w:r>
-      <w:r>
-        <w:rPr>
-          <w:rFonts w:ascii="David" w:hAnsi="David" w:cs="David"/>
-          <w:b/>
-          <w:bCs/>
-        </w:rPr>
-        <w:t>(</w:t>
-      </w:r>
-      <w:r>
-        <w:rPr>
-          <w:rFonts w:ascii="David" w:hAnsi="David" w:cs="David"/>
-          <w:b/>
-          <w:bCs/>
-        </w:rPr>
-        <w:t>Balanc</w:t>
-      </w:r>
-      <w:r>
-        <w:rPr>
-          <w:rFonts w:ascii="David" w:hAnsi="David" w:cs="David"/>
-          <w:b/>
-          <w:bCs/>
-        </w:rPr>
-        <w:t>ed):</w:t>
+        <w:t>Driver Representation (Balanced):</w:t>
       </w:r>
     </w:p>
     <w:p>
@@ -9064,31 +8628,7 @@
           <w:b/>
           <w:bCs/>
         </w:rPr>
-        <w:t xml:space="preserve">Track Representation </w:t>
-      </w:r>
-      <w:r>
-        <w:rPr>
-          <w:rFonts w:ascii="David" w:hAnsi="David" w:cs="David"/>
-          <w:b/>
-          <w:bCs/>
-        </w:rPr>
-        <w:t>(</w:t>
-      </w:r>
-      <w:r>
-        <w:rPr>
-          <w:rFonts w:ascii="David" w:hAnsi="David" w:cs="David"/>
-          <w:b/>
-          <w:bCs/>
-        </w:rPr>
-        <w:t>Unbalanc</w:t>
-      </w:r>
-      <w:r>
-        <w:rPr>
-          <w:rFonts w:ascii="David" w:hAnsi="David" w:cs="David"/>
-          <w:b/>
-          <w:bCs/>
-        </w:rPr>
-        <w:t>ed):</w:t>
+        <w:t>Track Representation (Unbalanced):</w:t>
       </w:r>
     </w:p>
     <w:p>
@@ -9180,31 +8720,7 @@
           <w:b/>
           <w:bCs/>
         </w:rPr>
-        <w:t xml:space="preserve">Corner Type Representation </w:t>
-      </w:r>
-      <w:r>
-        <w:rPr>
-          <w:rFonts w:ascii="David" w:hAnsi="David" w:cs="David"/>
-          <w:b/>
-          <w:bCs/>
-        </w:rPr>
-        <w:t>(</w:t>
-      </w:r>
-      <w:r>
-        <w:rPr>
-          <w:rFonts w:ascii="David" w:hAnsi="David" w:cs="David"/>
-          <w:b/>
-          <w:bCs/>
-        </w:rPr>
-        <w:t>Speed Profile Imbalance</w:t>
-      </w:r>
-      <w:r>
-        <w:rPr>
-          <w:rFonts w:ascii="David" w:hAnsi="David" w:cs="David"/>
-          <w:b/>
-          <w:bCs/>
-        </w:rPr>
-        <w:t>)</w:t>
+        <w:t>Corner Type Representation (Speed Profile Imbalance)</w:t>
       </w:r>
     </w:p>
     <w:p>
@@ -9506,6 +9022,7 @@
           <w:szCs w:val="32"/>
         </w:rPr>
         <w:tab/>
+        <w:t>Final Documentation</w:t>
       </w:r>
       <w:r>
         <w:rPr>
@@ -9515,8 +9032,566 @@
           <w:sz w:val="32"/>
           <w:szCs w:val="32"/>
         </w:rPr>
-        <w:t>Final Documentation</w:t>
-      </w:r>
+        <w:t>:</w:t>
+      </w:r>
+    </w:p>
+    <w:p>
+      <w:pPr>
+        <w:bidi w:val="0"/>
+        <w:spacing w:after="0" w:line="360" w:lineRule="auto"/>
+        <w:rPr>
+          <w:rFonts w:ascii="David" w:hAnsi="David" w:cs="David"/>
+          <w:b/>
+          <w:bCs/>
+        </w:rPr>
+      </w:pPr>
+    </w:p>
+    <w:p>
+      <w:pPr>
+        <w:bidi w:val="0"/>
+        <w:spacing w:after="0" w:line="360" w:lineRule="auto"/>
+        <w:rPr>
+          <w:rFonts w:ascii="David" w:hAnsi="David" w:cs="David"/>
+          <w:b/>
+          <w:bCs/>
+        </w:rPr>
+      </w:pPr>
+      <w:r>
+        <w:rPr>
+          <w:rFonts w:ascii="David" w:hAnsi="David" w:cs="David"/>
+          <w:b/>
+          <w:bCs/>
+        </w:rPr>
+        <w:t>Main Observations about the Dataset:</w:t>
+      </w:r>
+    </w:p>
+    <w:p>
+      <w:pPr>
+        <w:bidi w:val="0"/>
+        <w:spacing w:after="0" w:line="360" w:lineRule="auto"/>
+        <w:rPr>
+          <w:rFonts w:ascii="David" w:hAnsi="David" w:cs="David"/>
+        </w:rPr>
+      </w:pPr>
+      <w:r>
+        <w:rPr>
+          <w:rFonts w:ascii="David" w:hAnsi="David" w:cs="David"/>
+        </w:rPr>
+        <w:t>During the Exploratory Data Analysis (EDA) of the telemetry and driving style data, several critical observations emerged that shaped our understanding of the dataset</w:t>
+      </w:r>
+      <w:r>
+        <w:rPr>
+          <w:rFonts w:ascii="David" w:hAnsi="David" w:cs="David"/>
+          <w:rtl/>
+        </w:rPr>
+        <w:t>:</w:t>
+      </w:r>
+    </w:p>
+    <w:p>
+      <w:pPr>
+        <w:bidi w:val="0"/>
+        <w:spacing w:after="0" w:line="360" w:lineRule="auto"/>
+        <w:rPr>
+          <w:rFonts w:ascii="David" w:hAnsi="David" w:cs="David"/>
+        </w:rPr>
+      </w:pPr>
+    </w:p>
+    <w:p>
+      <w:pPr>
+        <w:bidi w:val="0"/>
+        <w:spacing w:after="0" w:line="360" w:lineRule="auto"/>
+        <w:rPr>
+          <w:rFonts w:ascii="David" w:hAnsi="David" w:cs="David"/>
+        </w:rPr>
+      </w:pPr>
+      <w:r>
+        <w:rPr>
+          <w:rFonts w:ascii="David" w:hAnsi="David" w:cs="David"/>
+        </w:rPr>
+        <w:t xml:space="preserve">Unique Driving Signatures vs. Track Constraints: The data clearly shows that each driver possesses a dynamic </w:t>
+      </w:r>
+      <w:r>
+        <w:rPr>
+          <w:rFonts w:ascii="David" w:hAnsi="David" w:cs="David"/>
+        </w:rPr>
+        <w:t>“</w:t>
+      </w:r>
+      <w:r>
+        <w:rPr>
+          <w:rFonts w:ascii="David" w:hAnsi="David" w:cs="David"/>
+        </w:rPr>
+        <w:t>fingerprint</w:t>
+      </w:r>
+      <w:r>
+        <w:rPr>
+          <w:rFonts w:ascii="David" w:hAnsi="David" w:cs="David"/>
+        </w:rPr>
+        <w:t>”</w:t>
+      </w:r>
+      <w:r>
+        <w:rPr>
+          <w:rFonts w:ascii="David" w:hAnsi="David" w:cs="David"/>
+        </w:rPr>
+        <w:t xml:space="preserve"> (</w:t>
+      </w:r>
+      <w:r>
+        <w:rPr>
+          <w:rFonts w:ascii="David" w:hAnsi="David" w:cs="David"/>
+        </w:rPr>
+        <w:t>for example,</w:t>
+      </w:r>
+      <w:r>
+        <w:rPr>
+          <w:rFonts w:ascii="David" w:hAnsi="David" w:cs="David"/>
+        </w:rPr>
+        <w:t xml:space="preserve"> a tendency to brake late or coast). However, we discovered that the physical layout of the circuit (Track Bias) exerts a much stronger influence than the differences in individual driving styles. For example, the average Entry Speed at Monza is tens of km/h higher than at a street circuit like Singapore. This proved that clustering raw data would result in grouping by track rather than by driver</w:t>
+      </w:r>
+      <w:r>
+        <w:rPr>
+          <w:rFonts w:ascii="David" w:hAnsi="David" w:cs="David"/>
+          <w:rtl/>
+        </w:rPr>
+        <w:t>.</w:t>
+      </w:r>
+    </w:p>
+    <w:p>
+      <w:pPr>
+        <w:bidi w:val="0"/>
+        <w:spacing w:after="0" w:line="360" w:lineRule="auto"/>
+        <w:rPr>
+          <w:rFonts w:ascii="David" w:hAnsi="David" w:cs="David"/>
+        </w:rPr>
+      </w:pPr>
+    </w:p>
+    <w:p>
+      <w:pPr>
+        <w:bidi w:val="0"/>
+        <w:spacing w:after="0" w:line="360" w:lineRule="auto"/>
+        <w:rPr>
+          <w:rFonts w:ascii="David" w:hAnsi="David" w:cs="David"/>
+        </w:rPr>
+      </w:pPr>
+      <w:r>
+        <w:rPr>
+          <w:rFonts w:ascii="David" w:hAnsi="David" w:cs="David"/>
+        </w:rPr>
+        <w:t>Physical Significance of Outliers: We identified a significant presence of outliers, particularly in features like Coasting_Pct (percentage of time spent coasting without pedal application) and Trail_Braking_Pct. Unlike financial datasets where anomalies are often data-entry errors, in Formula 1 telemetry, these outliers are authentic records. They represent genuine driving mistakes (such as lock-ups on tight tracks) or highly aggressive driving techniques (</w:t>
+      </w:r>
+      <w:r>
+        <w:rPr>
+          <w:rFonts w:ascii="David" w:hAnsi="David" w:cs="David"/>
+        </w:rPr>
+        <w:t>for example</w:t>
+      </w:r>
+      <w:r>
+        <w:rPr>
+          <w:rFonts w:ascii="David" w:hAnsi="David" w:cs="David"/>
+        </w:rPr>
+        <w:t xml:space="preserve"> 15% coasting in a corner where the grid average is 0%</w:t>
+      </w:r>
+      <w:r>
+        <w:rPr>
+          <w:rFonts w:ascii="David" w:hAnsi="David" w:cs="David"/>
+        </w:rPr>
+        <w:t>).</w:t>
+      </w:r>
+    </w:p>
+    <w:p>
+      <w:pPr>
+        <w:bidi w:val="0"/>
+        <w:spacing w:after="0" w:line="360" w:lineRule="auto"/>
+        <w:rPr>
+          <w:rFonts w:ascii="David" w:hAnsi="David" w:cs="David"/>
+        </w:rPr>
+      </w:pPr>
+    </w:p>
+    <w:p>
+      <w:pPr>
+        <w:bidi w:val="0"/>
+        <w:spacing w:after="0" w:line="360" w:lineRule="auto"/>
+        <w:rPr>
+          <w:rFonts w:ascii="David" w:hAnsi="David" w:cs="David"/>
+        </w:rPr>
+      </w:pPr>
+      <w:r>
+        <w:rPr>
+          <w:rFonts w:ascii="David" w:hAnsi="David" w:cs="David"/>
+        </w:rPr>
+        <w:t xml:space="preserve">Feature Correlation and Redundancy: The Correlation Heatmap revealed high correlations (often &gt; 0.8) between certain features, such as braking distance and braking time. This highlighted the absolute necessity of Feature Engineering to consolidate overlapping metrics into a normalized </w:t>
+      </w:r>
+      <w:r>
+        <w:rPr>
+          <w:rFonts w:ascii="David" w:hAnsi="David" w:cs="David"/>
+        </w:rPr>
+        <w:t>“</w:t>
+      </w:r>
+      <w:r>
+        <w:rPr>
+          <w:rFonts w:ascii="David" w:hAnsi="David" w:cs="David"/>
+        </w:rPr>
+        <w:t>aggressiveness</w:t>
+      </w:r>
+      <w:r>
+        <w:rPr>
+          <w:rFonts w:ascii="David" w:hAnsi="David" w:cs="David"/>
+        </w:rPr>
+        <w:t>”</w:t>
+      </w:r>
+      <w:r>
+        <w:rPr>
+          <w:rFonts w:ascii="David" w:hAnsi="David" w:cs="David"/>
+        </w:rPr>
+        <w:t xml:space="preserve"> score. Without this, a K-Means algorithm would inadvertently assign double weight to a single physical characteristic represented across multiple columns.</w:t>
+      </w:r>
+    </w:p>
+    <w:p>
+      <w:pPr>
+        <w:bidi w:val="0"/>
+        <w:spacing w:after="0" w:line="360" w:lineRule="auto"/>
+        <w:rPr>
+          <w:rFonts w:ascii="David" w:hAnsi="David" w:cs="David"/>
+          <w:b/>
+          <w:bCs/>
+        </w:rPr>
+      </w:pPr>
+    </w:p>
+    <w:p>
+      <w:pPr>
+        <w:bidi w:val="0"/>
+        <w:spacing w:after="0" w:line="360" w:lineRule="auto"/>
+        <w:rPr>
+          <w:rFonts w:ascii="David" w:hAnsi="David" w:cs="David"/>
+          <w:b/>
+          <w:bCs/>
+        </w:rPr>
+      </w:pPr>
+      <w:r>
+        <w:rPr>
+          <w:rFonts w:ascii="David" w:hAnsi="David" w:cs="David"/>
+          <w:b/>
+          <w:bCs/>
+        </w:rPr>
+        <w:t>Important Preprocessing Considerations</w:t>
+      </w:r>
+    </w:p>
+    <w:p>
+      <w:pPr>
+        <w:bidi w:val="0"/>
+        <w:spacing w:after="0" w:line="360" w:lineRule="auto"/>
+        <w:rPr>
+          <w:rFonts w:ascii="David" w:hAnsi="David" w:cs="David"/>
+        </w:rPr>
+      </w:pPr>
+      <w:r>
+        <w:rPr>
+          <w:rFonts w:ascii="David" w:hAnsi="David" w:cs="David"/>
+        </w:rPr>
+        <w:t>The data preprocessing phase required several fundamental engineering decisions to adapt continuous telemetry data for an unsupervised machine learning algorithm. The core considerations were as follows</w:t>
+      </w:r>
+      <w:r>
+        <w:rPr>
+          <w:rFonts w:ascii="David" w:hAnsi="David" w:cs="David"/>
+          <w:rtl/>
+        </w:rPr>
+        <w:t>:</w:t>
+      </w:r>
+    </w:p>
+    <w:p>
+      <w:pPr>
+        <w:bidi w:val="0"/>
+        <w:spacing w:after="0" w:line="360" w:lineRule="auto"/>
+        <w:rPr>
+          <w:rFonts w:ascii="David" w:hAnsi="David" w:cs="David"/>
+        </w:rPr>
+      </w:pPr>
+    </w:p>
+    <w:p>
+      <w:pPr>
+        <w:bidi w:val="0"/>
+        <w:spacing w:after="0" w:line="360" w:lineRule="auto"/>
+        <w:rPr>
+          <w:rFonts w:ascii="David" w:hAnsi="David" w:cs="David"/>
+        </w:rPr>
+      </w:pPr>
+      <w:r>
+        <w:rPr>
+          <w:rFonts w:ascii="David" w:hAnsi="David" w:cs="David"/>
+          <w:u w:val="single"/>
+        </w:rPr>
+        <w:t>Strategic Data Selection &amp; Context:</w:t>
+      </w:r>
+      <w:r>
+        <w:rPr>
+          <w:rFonts w:ascii="David" w:hAnsi="David" w:cs="David"/>
+        </w:rPr>
+        <w:t xml:space="preserve"> To ensure the model compares drivers when they are operating at absolute peak performance (Limit Handling) and under identical conditions, we chose to isolate the data to Qualifying sessions only, specifically extracting the single fastest lap per driver per track. This crucial decision neutralizes numerous confounding variables inherent to race conditions (such as fuel saving, tire degradation management, </w:t>
+      </w:r>
+      <w:r>
+        <w:rPr>
+          <w:rFonts w:ascii="David" w:hAnsi="David" w:cs="David"/>
+        </w:rPr>
+        <w:t>“</w:t>
+      </w:r>
+      <w:r>
+        <w:rPr>
+          <w:rFonts w:ascii="David" w:hAnsi="David" w:cs="David"/>
+        </w:rPr>
+        <w:t>dirty air</w:t>
+      </w:r>
+      <w:r>
+        <w:rPr>
+          <w:rFonts w:ascii="David" w:hAnsi="David" w:cs="David"/>
+        </w:rPr>
+        <w:t>”</w:t>
+      </w:r>
+      <w:r>
+        <w:rPr>
+          <w:rFonts w:ascii="David" w:hAnsi="David" w:cs="David"/>
+        </w:rPr>
+        <w:t xml:space="preserve"> from leading cars, and overtaking tactics), leaving us with a pure representation of the driver's and car's maximum limits</w:t>
+      </w:r>
+      <w:r>
+        <w:rPr>
+          <w:rFonts w:ascii="David" w:hAnsi="David" w:cs="David"/>
+          <w:rtl/>
+        </w:rPr>
+        <w:t>.</w:t>
+      </w:r>
+    </w:p>
+    <w:p>
+      <w:pPr>
+        <w:bidi w:val="0"/>
+        <w:spacing w:after="0" w:line="360" w:lineRule="auto"/>
+        <w:rPr>
+          <w:rFonts w:ascii="David" w:hAnsi="David" w:cs="David"/>
+        </w:rPr>
+      </w:pPr>
+    </w:p>
+    <w:p>
+      <w:pPr>
+        <w:bidi w:val="0"/>
+        <w:spacing w:after="0" w:line="360" w:lineRule="auto"/>
+        <w:rPr>
+          <w:rFonts w:ascii="David" w:hAnsi="David" w:cs="David"/>
+        </w:rPr>
+      </w:pPr>
+      <w:r>
+        <w:rPr>
+          <w:rFonts w:ascii="David" w:hAnsi="David" w:cs="David"/>
+          <w:u w:val="single"/>
+        </w:rPr>
+        <w:t>Sanitizing Sensor Glitches (Data Quality):</w:t>
+      </w:r>
+      <w:r>
+        <w:rPr>
+          <w:rFonts w:ascii="David" w:hAnsi="David" w:cs="David"/>
+        </w:rPr>
+        <w:t xml:space="preserve"> High-frequency telemetry data naturally suffers from measurement noise. During our EDA, we found phantom readings such as throttle applications registering at 104%, speeds of zero mid-lap, or sudden drops to neutral gear. We applied a physics-based logical cleaning mechanism: pedal inputs were clipped to a maximum of 100%, and rows containing physically impossible RPM or speed readings for a competitive flying lap were filtered out</w:t>
+      </w:r>
+      <w:r>
+        <w:rPr>
+          <w:rFonts w:ascii="David" w:hAnsi="David" w:cs="David"/>
+          <w:rtl/>
+        </w:rPr>
+        <w:t>.</w:t>
+      </w:r>
+    </w:p>
+    <w:p>
+      <w:pPr>
+        <w:bidi w:val="0"/>
+        <w:spacing w:after="0" w:line="360" w:lineRule="auto"/>
+        <w:rPr>
+          <w:rFonts w:ascii="David" w:hAnsi="David" w:cs="David"/>
+        </w:rPr>
+      </w:pPr>
+    </w:p>
+    <w:p>
+      <w:pPr>
+        <w:bidi w:val="0"/>
+        <w:spacing w:after="0" w:line="360" w:lineRule="auto"/>
+        <w:rPr>
+          <w:rFonts w:ascii="David" w:hAnsi="David" w:cs="David"/>
+        </w:rPr>
+      </w:pPr>
+      <w:r>
+        <w:rPr>
+          <w:rFonts w:ascii="David" w:hAnsi="David" w:cs="David"/>
+          <w:u w:val="single"/>
+        </w:rPr>
+        <w:t>Strategic Handling of Outliers:</w:t>
+      </w:r>
+      <w:r>
+        <w:rPr>
+          <w:rFonts w:ascii="David" w:hAnsi="David" w:cs="David"/>
+        </w:rPr>
+        <w:t xml:space="preserve"> As noted in our observations, we decided against applying aggressive outlier removal techniques (such as hard clipping, Winsorization, or dropping rows outside the IQR). Doing so would have erased the exact nuances that separate a smooth driving style from an erratic or aggressive one. Instead, extreme values were retained and managed during the scaling phase using robust methodologies</w:t>
+      </w:r>
+      <w:r>
+        <w:rPr>
+          <w:rFonts w:ascii="David" w:hAnsi="David" w:cs="David"/>
+          <w:rtl/>
+        </w:rPr>
+        <w:t>.</w:t>
+      </w:r>
+    </w:p>
+    <w:p>
+      <w:pPr>
+        <w:bidi w:val="0"/>
+        <w:spacing w:after="0" w:line="360" w:lineRule="auto"/>
+        <w:rPr>
+          <w:rFonts w:ascii="David" w:hAnsi="David" w:cs="David"/>
+        </w:rPr>
+      </w:pPr>
+    </w:p>
+    <w:p>
+      <w:pPr>
+        <w:bidi w:val="0"/>
+        <w:spacing w:after="0" w:line="360" w:lineRule="auto"/>
+        <w:rPr>
+          <w:rFonts w:ascii="David" w:hAnsi="David" w:cs="David"/>
+        </w:rPr>
+      </w:pPr>
+      <w:r>
+        <w:rPr>
+          <w:rFonts w:ascii="David" w:hAnsi="David" w:cs="David"/>
+          <w:u w:val="single"/>
+        </w:rPr>
+        <w:t xml:space="preserve">Context-Aware Scaling (The </w:t>
+      </w:r>
+      <w:r>
+        <w:rPr>
+          <w:rFonts w:ascii="David" w:hAnsi="David" w:cs="David"/>
+          <w:u w:val="single"/>
+        </w:rPr>
+        <w:t>“</w:t>
+      </w:r>
+      <w:r>
+        <w:rPr>
+          <w:rFonts w:ascii="David" w:hAnsi="David" w:cs="David"/>
+          <w:u w:val="single"/>
+        </w:rPr>
+        <w:t>Per-Corner</w:t>
+      </w:r>
+      <w:r>
+        <w:rPr>
+          <w:rFonts w:ascii="David" w:hAnsi="David" w:cs="David"/>
+          <w:u w:val="single"/>
+        </w:rPr>
+        <w:t>”</w:t>
+      </w:r>
+      <w:r>
+        <w:rPr>
+          <w:rFonts w:ascii="David" w:hAnsi="David" w:cs="David"/>
+          <w:u w:val="single"/>
+        </w:rPr>
+        <w:t xml:space="preserve"> Method):</w:t>
+      </w:r>
+      <w:r>
+        <w:rPr>
+          <w:rFonts w:ascii="David" w:hAnsi="David" w:cs="David"/>
+        </w:rPr>
+        <w:t xml:space="preserve"> This was the pivotal engineering decision of the project. Because K-Means relies on Euclidean distance, leaving data in its original scales (km/h vs. percentages) would severely distort the model. To solve both the scale disparity and the aforementioned </w:t>
+      </w:r>
+      <w:r>
+        <w:rPr>
+          <w:rFonts w:ascii="David" w:hAnsi="David" w:cs="David"/>
+        </w:rPr>
+        <w:t>“</w:t>
+      </w:r>
+      <w:r>
+        <w:rPr>
+          <w:rFonts w:ascii="David" w:hAnsi="David" w:cs="David"/>
+        </w:rPr>
+        <w:t>Track Bias</w:t>
+      </w:r>
+      <w:r>
+        <w:rPr>
+          <w:rFonts w:ascii="David" w:hAnsi="David" w:cs="David"/>
+        </w:rPr>
+        <w:t>”,</w:t>
+      </w:r>
+      <w:r>
+        <w:rPr>
+          <w:rFonts w:ascii="David" w:hAnsi="David" w:cs="David"/>
+        </w:rPr>
+        <w:t xml:space="preserve"> we implemented Group-wise Z-Score Scaling (Per-Corner Scaling</w:t>
+      </w:r>
+      <w:r>
+        <w:rPr>
+          <w:rFonts w:ascii="David" w:hAnsi="David" w:cs="David"/>
+        </w:rPr>
+        <w:t>)</w:t>
+      </w:r>
+      <w:r>
+        <w:rPr>
+          <w:rFonts w:ascii="David" w:hAnsi="David" w:cs="David"/>
+          <w:rtl/>
+        </w:rPr>
+        <w:t>.</w:t>
+      </w:r>
+    </w:p>
+    <w:p>
+      <w:pPr>
+        <w:bidi w:val="0"/>
+        <w:spacing w:after="0" w:line="360" w:lineRule="auto"/>
+        <w:rPr>
+          <w:rFonts w:ascii="David" w:hAnsi="David" w:cs="David"/>
+        </w:rPr>
+      </w:pPr>
+      <w:r>
+        <w:rPr>
+          <w:rFonts w:ascii="David" w:hAnsi="David" w:cs="David"/>
+        </w:rPr>
+        <w:t xml:space="preserve">Instead of normalizing a feature (like braking percentage) against the overall season average, we normalized it against the mean and standard deviation of all drivers in that specific corner on that specific track. This technique successfully zeroed out the influence of the track layout, allowing us to feed multiple diverse tracks into a single model. What remained was pure </w:t>
+      </w:r>
+      <w:r>
+        <w:rPr>
+          <w:rFonts w:ascii="David" w:hAnsi="David" w:cs="David"/>
+        </w:rPr>
+        <w:t>“</w:t>
+      </w:r>
+      <w:r>
+        <w:rPr>
+          <w:rFonts w:ascii="David" w:hAnsi="David" w:cs="David"/>
+        </w:rPr>
+        <w:t>delta</w:t>
+      </w:r>
+      <w:r>
+        <w:rPr>
+          <w:rFonts w:ascii="David" w:hAnsi="David" w:cs="David"/>
+        </w:rPr>
+        <w:t>”</w:t>
+      </w:r>
+      <w:r>
+        <w:rPr>
+          <w:rFonts w:ascii="David" w:hAnsi="David" w:cs="David"/>
+        </w:rPr>
+        <w:t xml:space="preserve"> — the specific driver's deviation from the group norm at that exact geographical coordinate.</w:t>
+      </w:r>
+    </w:p>
+    <w:p>
+      <w:pPr>
+        <w:bidi w:val="0"/>
+        <w:spacing w:after="0" w:line="360" w:lineRule="auto"/>
+        <w:rPr>
+          <w:rFonts w:ascii="David" w:hAnsi="David" w:cs="David"/>
+          <w:b/>
+          <w:bCs/>
+          <w:rtl/>
+        </w:rPr>
+      </w:pPr>
+    </w:p>
+    <w:p>
+      <w:pPr>
+        <w:bidi w:val="0"/>
+        <w:spacing w:after="0" w:line="360" w:lineRule="auto"/>
+        <w:rPr>
+          <w:rFonts w:ascii="David" w:hAnsi="David" w:cs="David"/>
+          <w:sz w:val="32"/>
+          <w:szCs w:val="32"/>
+          <w:rtl/>
+        </w:rPr>
+      </w:pPr>
       <w:r>
         <w:rPr>
           <w:rFonts w:ascii="David" w:hAnsi="David" w:cs="David"/>
@@ -9525,626 +9600,50 @@
           <w:sz w:val="32"/>
           <w:szCs w:val="32"/>
         </w:rPr>
-        <w:t>:</w:t>
-      </w:r>
-    </w:p>
-    <w:p>
-      <w:pPr>
-        <w:bidi w:val="0"/>
-        <w:spacing w:after="0" w:line="360" w:lineRule="auto"/>
-        <w:rPr>
-          <w:rFonts w:ascii="David" w:hAnsi="David" w:cs="David"/>
-          <w:b/>
-          <w:bCs/>
-        </w:rPr>
-      </w:pPr>
-    </w:p>
-    <w:p>
-      <w:pPr>
-        <w:bidi w:val="0"/>
-        <w:spacing w:after="0" w:line="360" w:lineRule="auto"/>
-        <w:rPr>
-          <w:rFonts w:ascii="David" w:hAnsi="David" w:cs="David"/>
-          <w:b/>
-          <w:bCs/>
-        </w:rPr>
-      </w:pPr>
-      <w:r>
-        <w:rPr>
-          <w:rFonts w:ascii="David" w:hAnsi="David" w:cs="David"/>
-          <w:b/>
-          <w:bCs/>
-        </w:rPr>
-        <w:t>Main Observations about the Dataset</w:t>
-      </w:r>
-      <w:r>
-        <w:rPr>
-          <w:rFonts w:ascii="David" w:hAnsi="David" w:cs="David"/>
-          <w:b/>
-          <w:bCs/>
-        </w:rPr>
-        <w:t>:</w:t>
-      </w:r>
-    </w:p>
-    <w:p>
-      <w:pPr>
-        <w:bidi w:val="0"/>
-        <w:spacing w:after="0" w:line="360" w:lineRule="auto"/>
-        <w:rPr>
-          <w:rFonts w:ascii="David" w:hAnsi="David" w:cs="David"/>
-        </w:rPr>
-      </w:pPr>
-      <w:r>
-        <w:rPr>
-          <w:rFonts w:ascii="David" w:hAnsi="David" w:cs="David"/>
-        </w:rPr>
-        <w:t>During the Exploratory Data Analysis (EDA) of the telemetry and driving style data, several critical observations emerged that shaped our understanding of the dataset</w:t>
+        <w:t>Work process:</w:t>
+      </w:r>
+    </w:p>
+    <w:p>
+      <w:pPr>
+        <w:bidi w:val="0"/>
+        <w:spacing w:after="0" w:line="360" w:lineRule="auto"/>
+        <w:rPr>
+          <w:rFonts w:ascii="David" w:hAnsi="David" w:cs="David"/>
+        </w:rPr>
+      </w:pPr>
+      <w:r>
+        <w:rPr>
+          <w:rFonts w:ascii="David" w:hAnsi="David" w:cs="David"/>
+        </w:rPr>
+        <w:t xml:space="preserve">Oren - </w:t>
       </w:r>
       <w:r>
         <w:rPr>
           <w:rFonts w:ascii="David" w:hAnsi="David" w:cs="David"/>
           <w:rtl/>
         </w:rPr>
-        <w:t>:</w:t>
-      </w:r>
-    </w:p>
-    <w:p>
-      <w:pPr>
-        <w:bidi w:val="0"/>
-        <w:spacing w:after="0" w:line="360" w:lineRule="auto"/>
-        <w:rPr>
-          <w:rFonts w:ascii="David" w:hAnsi="David" w:cs="David"/>
-        </w:rPr>
-      </w:pPr>
-    </w:p>
-    <w:p>
-      <w:pPr>
-        <w:bidi w:val="0"/>
-        <w:spacing w:after="0" w:line="360" w:lineRule="auto"/>
-        <w:rPr>
-          <w:rFonts w:ascii="David" w:hAnsi="David" w:cs="David"/>
-        </w:rPr>
-      </w:pPr>
-      <w:r>
-        <w:rPr>
-          <w:rFonts w:ascii="David" w:hAnsi="David" w:cs="David"/>
-        </w:rPr>
-        <w:t xml:space="preserve">Unique Driving Signatures vs. Track Constraints: The data clearly shows that each driver possesses a dynamic </w:t>
-      </w:r>
-      <w:r>
-        <w:rPr>
-          <w:rFonts w:ascii="David" w:hAnsi="David" w:cs="David"/>
-        </w:rPr>
-        <w:t>“</w:t>
-      </w:r>
-      <w:r>
-        <w:rPr>
-          <w:rFonts w:ascii="David" w:hAnsi="David" w:cs="David"/>
-        </w:rPr>
-        <w:t>fingerprint</w:t>
-      </w:r>
-      <w:r>
-        <w:rPr>
-          <w:rFonts w:ascii="David" w:hAnsi="David" w:cs="David"/>
-        </w:rPr>
-        <w:t>”</w:t>
-      </w:r>
-      <w:r>
-        <w:rPr>
-          <w:rFonts w:ascii="David" w:hAnsi="David" w:cs="David"/>
-        </w:rPr>
-        <w:t xml:space="preserve"> (</w:t>
-      </w:r>
-      <w:r>
-        <w:rPr>
-          <w:rFonts w:ascii="David" w:hAnsi="David" w:cs="David"/>
-        </w:rPr>
-        <w:t>for example,</w:t>
-      </w:r>
-      <w:r>
-        <w:rPr>
-          <w:rFonts w:ascii="David" w:hAnsi="David" w:cs="David"/>
-        </w:rPr>
-        <w:t xml:space="preserve"> a tendency to brake late or coast). However, we discovered that the physical layout of the circuit (Track Bias) exerts a much stronger influence than the differences in individual driving styles. For example, the average Entry Speed at Monza is tens of km/h higher than at a street circuit like Singapore. This proved that clustering raw data would result in grouping by track rather than by driver</w:t>
+        <w:t xml:space="preserve"> 1,2,4,5,6</w:t>
+      </w:r>
+    </w:p>
+    <w:p>
+      <w:pPr>
+        <w:bidi w:val="0"/>
+        <w:spacing w:after="0" w:line="360" w:lineRule="auto"/>
+        <w:rPr>
+          <w:rFonts w:ascii="David" w:hAnsi="David" w:cs="David"/>
+        </w:rPr>
+      </w:pPr>
+      <w:r>
+        <w:rPr>
+          <w:rFonts w:ascii="David" w:hAnsi="David" w:cs="David"/>
+        </w:rPr>
+        <w:t xml:space="preserve">Ido - </w:t>
       </w:r>
       <w:r>
         <w:rPr>
           <w:rFonts w:ascii="David" w:hAnsi="David" w:cs="David"/>
           <w:rtl/>
         </w:rPr>
-        <w:t>.</w:t>
-      </w:r>
-    </w:p>
-    <w:p>
-      <w:pPr>
-        <w:bidi w:val="0"/>
-        <w:spacing w:after="0" w:line="360" w:lineRule="auto"/>
-        <w:rPr>
-          <w:rFonts w:ascii="David" w:hAnsi="David" w:cs="David"/>
-        </w:rPr>
-      </w:pPr>
-    </w:p>
-    <w:p>
-      <w:pPr>
-        <w:bidi w:val="0"/>
-        <w:spacing w:after="0" w:line="360" w:lineRule="auto"/>
-        <w:rPr>
-          <w:rFonts w:ascii="David" w:hAnsi="David" w:cs="David"/>
-        </w:rPr>
-      </w:pPr>
-      <w:r>
-        <w:rPr>
-          <w:rFonts w:ascii="David" w:hAnsi="David" w:cs="David"/>
-        </w:rPr>
-        <w:t>Physical Significance of Outliers: We identified a significant presence of outliers, particularly in features like Coasting_Pct (percentage of time spent coasting without pedal application) and Trail_Braking_Pct. Unlike financial datasets where anomalies are often data-entry errors, in Formula 1 telemetry, these outliers are authentic records. They represent genuine driving mistakes (such as lock-ups on tight tracks) or highly aggressive driving techniques (</w:t>
-      </w:r>
-      <w:r>
-        <w:rPr>
-          <w:rFonts w:ascii="David" w:hAnsi="David" w:cs="David"/>
-        </w:rPr>
-        <w:t>for example</w:t>
-      </w:r>
-      <w:r>
-        <w:rPr>
-          <w:rFonts w:ascii="David" w:hAnsi="David" w:cs="David"/>
-        </w:rPr>
-        <w:t xml:space="preserve"> 15% coasting in a corner where the grid average is 0%</w:t>
-      </w:r>
-      <w:r>
-        <w:rPr>
-          <w:rFonts w:ascii="David" w:hAnsi="David" w:cs="David"/>
-        </w:rPr>
-        <w:t>).</w:t>
-      </w:r>
-    </w:p>
-    <w:p>
-      <w:pPr>
-        <w:bidi w:val="0"/>
-        <w:spacing w:after="0" w:line="360" w:lineRule="auto"/>
-        <w:rPr>
-          <w:rFonts w:ascii="David" w:hAnsi="David" w:cs="David"/>
-        </w:rPr>
-      </w:pPr>
-    </w:p>
-    <w:p>
-      <w:pPr>
-        <w:bidi w:val="0"/>
-        <w:spacing w:after="0" w:line="360" w:lineRule="auto"/>
-        <w:rPr>
-          <w:rFonts w:ascii="David" w:hAnsi="David" w:cs="David"/>
-        </w:rPr>
-      </w:pPr>
-      <w:r>
-        <w:rPr>
-          <w:rFonts w:ascii="David" w:hAnsi="David" w:cs="David"/>
-        </w:rPr>
-        <w:t xml:space="preserve">Feature Correlation and Redundancy: The Correlation Heatmap revealed high correlations (often &gt; 0.8) between certain features, such as braking distance and braking time. This highlighted the absolute necessity of Feature Engineering to consolidate overlapping metrics into a normalized </w:t>
-      </w:r>
-      <w:r>
-        <w:rPr>
-          <w:rFonts w:ascii="David" w:hAnsi="David" w:cs="David"/>
-        </w:rPr>
-        <w:t>“</w:t>
-      </w:r>
-      <w:r>
-        <w:rPr>
-          <w:rFonts w:ascii="David" w:hAnsi="David" w:cs="David"/>
-        </w:rPr>
-        <w:t>aggressiveness</w:t>
-      </w:r>
-      <w:r>
-        <w:rPr>
-          <w:rFonts w:ascii="David" w:hAnsi="David" w:cs="David"/>
-        </w:rPr>
-        <w:t>”</w:t>
-      </w:r>
-      <w:r>
-        <w:rPr>
-          <w:rFonts w:ascii="David" w:hAnsi="David" w:cs="David"/>
-        </w:rPr>
-        <w:t xml:space="preserve"> score. Without this, a K-Means algorithm would inadvertently assign double weight to a single physical characteristic represented across multiple columns.</w:t>
-      </w:r>
-    </w:p>
-    <w:p>
-      <w:pPr>
-        <w:bidi w:val="0"/>
-        <w:spacing w:after="0" w:line="360" w:lineRule="auto"/>
-        <w:rPr>
-          <w:rFonts w:ascii="David" w:hAnsi="David" w:cs="David"/>
-          <w:b/>
-          <w:bCs/>
-        </w:rPr>
-      </w:pPr>
-    </w:p>
-    <w:p>
-      <w:pPr>
-        <w:bidi w:val="0"/>
-        <w:spacing w:after="0" w:line="360" w:lineRule="auto"/>
-        <w:rPr>
-          <w:rFonts w:ascii="David" w:hAnsi="David" w:cs="David"/>
-          <w:b/>
-          <w:bCs/>
-        </w:rPr>
-      </w:pPr>
-      <w:r>
-        <w:rPr>
-          <w:rFonts w:ascii="David" w:hAnsi="David" w:cs="David"/>
-          <w:b/>
-          <w:bCs/>
-        </w:rPr>
-        <w:t>Important Preprocessing Considerations</w:t>
-      </w:r>
-    </w:p>
-    <w:p>
-      <w:pPr>
-        <w:bidi w:val="0"/>
-        <w:spacing w:after="0" w:line="360" w:lineRule="auto"/>
-        <w:rPr>
-          <w:rFonts w:ascii="David" w:hAnsi="David" w:cs="David"/>
-        </w:rPr>
-      </w:pPr>
-      <w:r>
-        <w:rPr>
-          <w:rFonts w:ascii="David" w:hAnsi="David" w:cs="David"/>
-        </w:rPr>
-        <w:t>The data preprocessing phase required several fundamental engineering decisions to adapt continuous telemetry data for an unsupervised machine learning algorithm. The core considerations were as follows</w:t>
-      </w:r>
-      <w:r>
-        <w:rPr>
-          <w:rFonts w:ascii="David" w:hAnsi="David" w:cs="David"/>
-          <w:rtl/>
-        </w:rPr>
-        <w:t>:</w:t>
-      </w:r>
-    </w:p>
-    <w:p>
-      <w:pPr>
-        <w:bidi w:val="0"/>
-        <w:spacing w:after="0" w:line="360" w:lineRule="auto"/>
-        <w:rPr>
-          <w:rFonts w:ascii="David" w:hAnsi="David" w:cs="David"/>
-        </w:rPr>
-      </w:pPr>
-    </w:p>
-    <w:p>
-      <w:pPr>
-        <w:bidi w:val="0"/>
-        <w:spacing w:after="0" w:line="360" w:lineRule="auto"/>
-        <w:rPr>
-          <w:rFonts w:ascii="David" w:hAnsi="David" w:cs="David"/>
-        </w:rPr>
-      </w:pPr>
-      <w:r>
-        <w:rPr>
-          <w:rFonts w:ascii="David" w:hAnsi="David" w:cs="David"/>
-          <w:u w:val="single"/>
-        </w:rPr>
-        <w:t>Strategic Data Selection &amp; Context:</w:t>
-      </w:r>
-      <w:r>
-        <w:rPr>
-          <w:rFonts w:ascii="David" w:hAnsi="David" w:cs="David"/>
-        </w:rPr>
-        <w:t xml:space="preserve"> To ensure the model compares drivers when they are operating at absolute peak performance (Limit Handling) and under identical conditions, we chose to isolate the data to Qualifying sessions only, specifically extracting the single fastest lap per driver per track. This crucial decision neutralizes numerous confounding variables inherent to race conditions (such as fuel saving, tire degradation management, </w:t>
-      </w:r>
-      <w:r>
-        <w:rPr>
-          <w:rFonts w:ascii="David" w:hAnsi="David" w:cs="David"/>
-        </w:rPr>
-        <w:t>“</w:t>
-      </w:r>
-      <w:r>
-        <w:rPr>
-          <w:rFonts w:ascii="David" w:hAnsi="David" w:cs="David"/>
-        </w:rPr>
-        <w:t>dirty air</w:t>
-      </w:r>
-      <w:r>
-        <w:rPr>
-          <w:rFonts w:ascii="David" w:hAnsi="David" w:cs="David"/>
-        </w:rPr>
-        <w:t>”</w:t>
-      </w:r>
-      <w:r>
-        <w:rPr>
-          <w:rFonts w:ascii="David" w:hAnsi="David" w:cs="David"/>
-        </w:rPr>
-        <w:t xml:space="preserve"> from leading cars, and overtaking tactics), leaving us with a pure representation of the driver's and car's maximum limits</w:t>
-      </w:r>
-      <w:r>
-        <w:rPr>
-          <w:rFonts w:ascii="David" w:hAnsi="David" w:cs="David"/>
-          <w:rtl/>
-        </w:rPr>
-        <w:t>.</w:t>
-      </w:r>
-    </w:p>
-    <w:p>
-      <w:pPr>
-        <w:bidi w:val="0"/>
-        <w:spacing w:after="0" w:line="360" w:lineRule="auto"/>
-        <w:rPr>
-          <w:rFonts w:ascii="David" w:hAnsi="David" w:cs="David"/>
-        </w:rPr>
-      </w:pPr>
-    </w:p>
-    <w:p>
-      <w:pPr>
-        <w:bidi w:val="0"/>
-        <w:spacing w:after="0" w:line="360" w:lineRule="auto"/>
-        <w:rPr>
-          <w:rFonts w:ascii="David" w:hAnsi="David" w:cs="David"/>
-        </w:rPr>
-      </w:pPr>
-      <w:r>
-        <w:rPr>
-          <w:rFonts w:ascii="David" w:hAnsi="David" w:cs="David"/>
-          <w:u w:val="single"/>
-        </w:rPr>
-        <w:t>Sanitizing Sensor Glitches (Data Quality):</w:t>
-      </w:r>
-      <w:r>
-        <w:rPr>
-          <w:rFonts w:ascii="David" w:hAnsi="David" w:cs="David"/>
-        </w:rPr>
-        <w:t xml:space="preserve"> High-frequency telemetry data naturally suffers from measurement noise. During our EDA, we found phantom readings such as throttle applications registering at 104%, speeds of zero mid-lap, or sudden drops to neutral gear. We applied a physics-based logical cleaning mechanism: pedal inputs were clipped to a maximum of 100%, and rows containing physically impossible RPM or speed readings for a competitive flying lap were filtered out</w:t>
-      </w:r>
-      <w:r>
-        <w:rPr>
-          <w:rFonts w:ascii="David" w:hAnsi="David" w:cs="David"/>
-          <w:rtl/>
-        </w:rPr>
-        <w:t>.</w:t>
-      </w:r>
-    </w:p>
-    <w:p>
-      <w:pPr>
-        <w:bidi w:val="0"/>
-        <w:spacing w:after="0" w:line="360" w:lineRule="auto"/>
-        <w:rPr>
-          <w:rFonts w:ascii="David" w:hAnsi="David" w:cs="David"/>
-        </w:rPr>
-      </w:pPr>
-    </w:p>
-    <w:p>
-      <w:pPr>
-        <w:bidi w:val="0"/>
-        <w:spacing w:after="0" w:line="360" w:lineRule="auto"/>
-        <w:rPr>
-          <w:rFonts w:ascii="David" w:hAnsi="David" w:cs="David"/>
-        </w:rPr>
-      </w:pPr>
-      <w:r>
-        <w:rPr>
-          <w:rFonts w:ascii="David" w:hAnsi="David" w:cs="David"/>
-          <w:u w:val="single"/>
-        </w:rPr>
-        <w:t>Strategic Handling of Outliers:</w:t>
-      </w:r>
-      <w:r>
-        <w:rPr>
-          <w:rFonts w:ascii="David" w:hAnsi="David" w:cs="David"/>
-        </w:rPr>
-        <w:t xml:space="preserve"> As noted in our observations, we decided against applying aggressive outlier removal techniques (such as hard clipping, Winsorization, or dropping rows outside the IQR). Doing so would have erased the exact nuances that separate a smooth driving style from an erratic or aggressive one. Instead, extreme values were retained and managed during the scaling phase using robust methodologies</w:t>
-      </w:r>
-      <w:r>
-        <w:rPr>
-          <w:rFonts w:ascii="David" w:hAnsi="David" w:cs="David"/>
-          <w:rtl/>
-        </w:rPr>
-        <w:t>.</w:t>
-      </w:r>
-    </w:p>
-    <w:p>
-      <w:pPr>
-        <w:bidi w:val="0"/>
-        <w:spacing w:after="0" w:line="360" w:lineRule="auto"/>
-        <w:rPr>
-          <w:rFonts w:ascii="David" w:hAnsi="David" w:cs="David"/>
-        </w:rPr>
-      </w:pPr>
-    </w:p>
-    <w:p>
-      <w:pPr>
-        <w:bidi w:val="0"/>
-        <w:spacing w:after="0" w:line="360" w:lineRule="auto"/>
-        <w:rPr>
-          <w:rFonts w:ascii="David" w:hAnsi="David" w:cs="David"/>
-        </w:rPr>
-      </w:pPr>
-      <w:r>
-        <w:rPr>
-          <w:rFonts w:ascii="David" w:hAnsi="David" w:cs="David"/>
-          <w:u w:val="single"/>
-        </w:rPr>
-        <w:t xml:space="preserve">Context-Aware Scaling (The </w:t>
-      </w:r>
-      <w:r>
-        <w:rPr>
-          <w:rFonts w:ascii="David" w:hAnsi="David" w:cs="David"/>
-          <w:u w:val="single"/>
-        </w:rPr>
-        <w:t>“</w:t>
-      </w:r>
-      <w:r>
-        <w:rPr>
-          <w:rFonts w:ascii="David" w:hAnsi="David" w:cs="David"/>
-          <w:u w:val="single"/>
-        </w:rPr>
-        <w:t>Per-Corner</w:t>
-      </w:r>
-      <w:r>
-        <w:rPr>
-          <w:rFonts w:ascii="David" w:hAnsi="David" w:cs="David"/>
-          <w:u w:val="single"/>
-        </w:rPr>
-        <w:t>”</w:t>
-      </w:r>
-      <w:r>
-        <w:rPr>
-          <w:rFonts w:ascii="David" w:hAnsi="David" w:cs="David"/>
-          <w:u w:val="single"/>
-        </w:rPr>
-        <w:t xml:space="preserve"> Method):</w:t>
-      </w:r>
-      <w:r>
-        <w:rPr>
-          <w:rFonts w:ascii="David" w:hAnsi="David" w:cs="David"/>
-        </w:rPr>
-        <w:t xml:space="preserve"> This was the pivotal engineering decision of the project. Because K-Means relies on Euclidean distance, leaving data in its original scales (km/h vs. percentages) would severely distort the model. To solve both the scale disparity and the aforementioned </w:t>
-      </w:r>
-      <w:r>
-        <w:rPr>
-          <w:rFonts w:ascii="David" w:hAnsi="David" w:cs="David"/>
-        </w:rPr>
-        <w:t>“</w:t>
-      </w:r>
-      <w:r>
-        <w:rPr>
-          <w:rFonts w:ascii="David" w:hAnsi="David" w:cs="David"/>
-        </w:rPr>
-        <w:t>Track Bias</w:t>
-      </w:r>
-      <w:r>
-        <w:rPr>
-          <w:rFonts w:ascii="David" w:hAnsi="David" w:cs="David"/>
-        </w:rPr>
-        <w:t>”,</w:t>
-      </w:r>
-      <w:r>
-        <w:rPr>
-          <w:rFonts w:ascii="David" w:hAnsi="David" w:cs="David"/>
-        </w:rPr>
-        <w:t xml:space="preserve"> we implemented Group-wise Z-Score Scaling (Per-Corner Scaling</w:t>
-      </w:r>
-      <w:r>
-        <w:rPr>
-          <w:rFonts w:ascii="David" w:hAnsi="David" w:cs="David"/>
-        </w:rPr>
-        <w:t>)</w:t>
-      </w:r>
-      <w:r>
-        <w:rPr>
-          <w:rFonts w:ascii="David" w:hAnsi="David" w:cs="David"/>
-          <w:rtl/>
-        </w:rPr>
-        <w:t>.</w:t>
-      </w:r>
-    </w:p>
-    <w:p>
-      <w:pPr>
-        <w:bidi w:val="0"/>
-        <w:spacing w:after="0" w:line="360" w:lineRule="auto"/>
-        <w:rPr>
-          <w:rFonts w:ascii="David" w:hAnsi="David" w:cs="David"/>
-        </w:rPr>
-      </w:pPr>
-      <w:r>
-        <w:rPr>
-          <w:rFonts w:ascii="David" w:hAnsi="David" w:cs="David"/>
-        </w:rPr>
-        <w:t xml:space="preserve">Instead of normalizing a feature (like braking percentage) against the overall season average, we normalized it against the mean and standard deviation of all drivers in that specific corner on that specific track. This technique successfully zeroed out the influence of the track layout, allowing us to feed multiple diverse tracks into a single model. What remained was pure </w:t>
-      </w:r>
-      <w:r>
-        <w:rPr>
-          <w:rFonts w:ascii="David" w:hAnsi="David" w:cs="David"/>
-        </w:rPr>
-        <w:t>“</w:t>
-      </w:r>
-      <w:r>
-        <w:rPr>
-          <w:rFonts w:ascii="David" w:hAnsi="David" w:cs="David"/>
-        </w:rPr>
-        <w:t>delta</w:t>
-      </w:r>
-      <w:r>
-        <w:rPr>
-          <w:rFonts w:ascii="David" w:hAnsi="David" w:cs="David"/>
-        </w:rPr>
-        <w:t>”</w:t>
-      </w:r>
-      <w:r>
-        <w:rPr>
-          <w:rFonts w:ascii="David" w:hAnsi="David" w:cs="David"/>
-        </w:rPr>
-        <w:t xml:space="preserve"> — the specific driver's deviation from the group norm at that exact geographical coordinate.</w:t>
-      </w:r>
-    </w:p>
-    <w:p>
-      <w:pPr>
-        <w:bidi w:val="0"/>
-        <w:spacing w:after="0" w:line="360" w:lineRule="auto"/>
-        <w:rPr>
-          <w:rFonts w:ascii="David" w:hAnsi="David" w:cs="David"/>
-          <w:b/>
-          <w:bCs/>
-          <w:rtl/>
-        </w:rPr>
-      </w:pPr>
-    </w:p>
-    <w:p>
-      <w:pPr>
-        <w:bidi w:val="0"/>
-        <w:spacing w:after="0" w:line="360" w:lineRule="auto"/>
-        <w:rPr>
-          <w:rFonts w:ascii="David" w:hAnsi="David" w:cs="David"/>
-          <w:sz w:val="32"/>
-          <w:szCs w:val="32"/>
-          <w:rtl/>
-        </w:rPr>
-      </w:pPr>
-      <w:r>
-        <w:rPr>
-          <w:rFonts w:ascii="David" w:hAnsi="David" w:cs="David"/>
-          <w:b/>
-          <w:bCs/>
-          <w:sz w:val="32"/>
-          <w:szCs w:val="32"/>
-        </w:rPr>
-        <w:t>Work process:</w:t>
-      </w:r>
-    </w:p>
-    <w:p>
-      <w:pPr>
-        <w:bidi w:val="0"/>
-        <w:spacing w:after="0" w:line="360" w:lineRule="auto"/>
-        <w:rPr>
-          <w:rFonts w:ascii="David" w:hAnsi="David" w:cs="David"/>
-        </w:rPr>
-      </w:pPr>
-      <w:r>
-        <w:rPr>
-          <w:rFonts w:ascii="David" w:hAnsi="David" w:cs="David"/>
-        </w:rPr>
-        <w:t xml:space="preserve">Oren - </w:t>
-      </w:r>
-      <w:r>
-        <w:rPr>
-          <w:rFonts w:ascii="David" w:hAnsi="David" w:cs="David"/>
-          <w:rtl/>
-        </w:rPr>
-        <w:t xml:space="preserve"> 1,2,4,5,6</w:t>
-      </w:r>
-    </w:p>
-    <w:p>
-      <w:pPr>
-        <w:bidi w:val="0"/>
-        <w:spacing w:after="0" w:line="360" w:lineRule="auto"/>
-        <w:rPr>
-          <w:rFonts w:ascii="David" w:hAnsi="David" w:cs="David"/>
-        </w:rPr>
-      </w:pPr>
-      <w:r>
-        <w:rPr>
-          <w:rFonts w:ascii="David" w:hAnsi="David" w:cs="David"/>
-        </w:rPr>
-        <w:t xml:space="preserve">Ido - </w:t>
-      </w:r>
-      <w:r>
-        <w:rPr>
-          <w:rFonts w:ascii="David" w:hAnsi="David" w:cs="David"/>
-          <w:rtl/>
-        </w:rPr>
         <w:t xml:space="preserve"> 3,4,5,6,8</w:t>
       </w:r>
     </w:p>
@@ -10153,7 +9652,7 @@
         <w:bidi w:val="0"/>
         <w:spacing w:after="0" w:line="360" w:lineRule="auto"/>
         <w:rPr>
-          <w:rFonts w:ascii="David" w:hAnsi="David" w:cs="David" w:hint="cs"/>
+          <w:rFonts w:ascii="David" w:hAnsi="David" w:cs="David"/>
         </w:rPr>
       </w:pPr>
       <w:r>

</xml_diff>